<commit_message>
Resolve the BO2 check in Table 3.3; log back to one font size
- Table 3.3: Milestone 1 set no number for the BO2 performance threshold and Milestone 2 added none; the Milestone 3 threshold (at least 80% recall) is met at 80.7%
- Ethics and AI usage log: Alexander's student numbers kept; title and headings back to 11 pt black
</commit_message>
<xml_diff>
--- a/report/BIN381_M3_Ethics_and_AI_Usage_Log.docx
+++ b/report/BIN381_M3_Ethics_and_AI_Usage_Log.docx
@@ -6,12 +6,12 @@
       <w:pPr>
         <w:pStyle w:val="Title"/>
         <w:rPr>
-          <w:szCs w:val="56"/>
+          <w:szCs w:val="22"/>
         </w:rPr>
       </w:pPr>
       <w:r>
         <w:rPr>
-          <w:szCs w:val="56"/>
+          <w:szCs w:val="22"/>
         </w:rPr>
         <w:t>Ethics and Responsible AI Usage Log: Milestone 3</w:t>
       </w:r>
@@ -5660,8 +5660,7 @@
     <w:rPr>
       <w:b/>
       <w:bCs/>
-      <w:color w:val="4472C4" w:themeColor="accent1"/>
-      <w:sz w:val="40"/>
+      <w:sz w:val="22"/>
     </w:rPr>
   </w:style>
   <w:style w:type="paragraph" w:styleId="Heading2">
@@ -5776,7 +5775,7 @@
     <w:rsid w:val="00E24EB5"/>
     <w:rPr>
       <w:b/>
-      <w:sz w:val="56"/>
+      <w:sz w:val="22"/>
     </w:rPr>
   </w:style>
   <w:style w:type="paragraph" w:customStyle="1" w:styleId="Strong1">

</xml_diff>